<commit_message>
Apply SOC2 CC8.2/CC8.3 controls: CI gates, Kyverno Enforce, Trivy scan
- ci.yml: add npm audit --audit-level=high to svc-alpha and svc-beta jobs
- ci.yml: rename docker-build to build-and-scan; add Trivy scan after each image build (CRITICAL,HIGH, ignore-unfixed)
- ci.yml: add deploy-gate job requiring manual approval via GitHub Environment 'production' on push to main (SOC2 CC8.2)
- terraform: add kyverno_enforcement_mode variable (default: Enforce) wired through root → platform module; both ClusterPolicies now block non-compliant resources in production
- CLAUDE.md: update security controls section to reflect new CI and Kyverno state
- Word docs: update all four EN/ZH documents with tracked changes reflecting the three SOC2 improvements

Co-Authored-By: Claude Sonnet 4.6 <noreply@anthropic.com>
</commit_message>
<xml_diff>
--- a/idp-local/IDP_Local_Functional_Spec.docx
+++ b/idp-local/IDP_Local_Functional_Spec.docx
@@ -2736,7 +2736,32 @@
           <w:sz w:val="19"/>
           <w:szCs w:val="19"/>
         </w:rPr>
-        <w:t xml:space="preserve">Two ClusterPolicies operate in Audit mode (violations recorded but not blocked — appropriate for demo):</w:t>
+        <w:t xml:space="preserve">Two ClusterPolicies operate in </w:t>
+      </w:r>
+      <w:del w:id="101" w:author="Claude" w:date="2026-05-06T00:00:00Z">
+        <w:r>
+          <w:rPr>
+            <w:sz w:val="19"/>
+            <w:szCs w:val="19"/>
+          </w:rPr>
+          <w:delText xml:space="preserve">Audit mode (violations recorded but not blocked — appropriate for demo)</w:delText>
+        </w:r>
+      </w:del>
+      <w:ins w:id="102" w:author="Claude" w:date="2026-05-06T00:00:00Z">
+        <w:r>
+          <w:rPr>
+            <w:sz w:val="19"/>
+            <w:szCs w:val="19"/>
+          </w:rPr>
+          <w:t xml:space="preserve">Enforce mode by default, blocking non-compliant resources. The mode is configurable via the kyverno_enforcement_mode Terraform variable (set to Audit for development environments)</w:t>
+        </w:r>
+      </w:ins>
+      <w:r>
+        <w:rPr>
+          <w:sz w:val="19"/>
+          <w:szCs w:val="19"/>
+        </w:rPr>
+        <w:t xml:space="preserve">:</w:t>
       </w:r>
     </w:p>
     <w:p>
@@ -6574,6 +6599,161 @@
         </w:rPr>
         <w:t xml:space="preserve">Backstage image uses pullPolicy: IfNotPresent to prevent silent updates</w:t>
       </w:r>
+    </w:p>
+    <w:p>
+      <w:pPr>
+        <w:pStyle w:val="ListParagraph"/>
+        <w:numPr>
+          <w:ilvl w:val="0"/>
+          <w:numId w:val="1"/>
+        </w:numPr>
+        <w:spacing w:after="60"/>
+        <w:rPr>
+          <w:ins w:id="103" w:author="Claude" w:date="2026-05-06T00:00:00Z"/>
+        </w:rPr>
+      </w:pPr>
+      <w:ins w:id="104" w:author="Claude" w:date="2026-05-06T00:00:00Z">
+        <w:r>
+          <w:rPr>
+            <w:sz w:val="19"/>
+            <w:szCs w:val="19"/>
+          </w:rPr>
+          <w:t xml:space="preserve">npm audit --audit-level=high runs in CI; blocks on HIGH/CRITICAL dependency vulnerabilities (SOC2 CC8.3)</w:t>
+        </w:r>
+      </w:ins>
+    </w:p>
+    <w:p>
+      <w:pPr>
+        <w:pStyle w:val="ListParagraph"/>
+        <w:numPr>
+          <w:ilvl w:val="0"/>
+          <w:numId w:val="1"/>
+        </w:numPr>
+        <w:spacing w:after="60"/>
+        <w:rPr>
+          <w:ins w:id="105" w:author="Claude" w:date="2026-05-06T00:00:00Z"/>
+        </w:rPr>
+      </w:pPr>
+      <w:ins w:id="106" w:author="Claude" w:date="2026-05-06T00:00:00Z">
+        <w:r>
+          <w:rPr>
+            <w:sz w:val="19"/>
+            <w:szCs w:val="19"/>
+          </w:rPr>
+          <w:t xml:space="preserve">Trivy container scan runs after every Docker build in CI; blocks on fixable HIGH/CRITICAL CVEs (SOC2 CC8.3)</w:t>
+        </w:r>
+      </w:ins>
+    </w:p>
+    <w:p>
+      <w:pPr>
+        <w:pStyle w:val="Heading2"/>
+        <w:spacing w:after="80" w:before="240"/>
+        <w:rPr>
+          <w:ins w:id="107" w:author="Claude" w:date="2026-05-06T00:00:00Z"/>
+          <w:b/>
+          <w:bCs/>
+          <w:color w:val="2F5496"/>
+          <w:sz w:val="26"/>
+          <w:szCs w:val="26"/>
+        </w:rPr>
+      </w:pPr>
+      <w:ins w:id="108" w:author="Claude" w:date="2026-05-06T00:00:00Z">
+        <w:r>
+          <w:rPr>
+            <w:b/>
+            <w:bCs/>
+            <w:color w:val="2F5496"/>
+            <w:sz w:val="26"/>
+            <w:szCs w:val="26"/>
+          </w:rPr>
+          <w:t xml:space="preserve">5.6 CI/CD Pipeline Security (SOC2 CC8.2 / CC8.3)</w:t>
+        </w:r>
+      </w:ins>
+    </w:p>
+    <w:p>
+      <w:pPr>
+        <w:spacing w:after="100"/>
+        <w:rPr>
+          <w:ins w:id="109" w:author="Claude" w:date="2026-05-06T00:00:00Z"/>
+          <w:sz w:val="19"/>
+          <w:szCs w:val="19"/>
+        </w:rPr>
+      </w:pPr>
+      <w:ins w:id="110" w:author="Claude" w:date="2026-05-06T00:00:00Z">
+        <w:r>
+          <w:rPr>
+            <w:sz w:val="19"/>
+            <w:szCs w:val="19"/>
+          </w:rPr>
+          <w:t xml:space="preserve">The GitHub Actions workflow (.github/workflows/ci.yml) enforces three security gates on every push to main:</w:t>
+        </w:r>
+      </w:ins>
+    </w:p>
+    <w:p>
+      <w:pPr>
+        <w:pStyle w:val="ListParagraph"/>
+        <w:numPr>
+          <w:ilvl w:val="0"/>
+          <w:numId w:val="1"/>
+        </w:numPr>
+        <w:spacing w:after="60"/>
+        <w:rPr>
+          <w:ins w:id="111" w:author="Claude" w:date="2026-05-06T00:00:00Z"/>
+        </w:rPr>
+      </w:pPr>
+      <w:ins w:id="112" w:author="Claude" w:date="2026-05-06T00:00:00Z">
+        <w:r>
+          <w:rPr>
+            <w:sz w:val="19"/>
+            <w:szCs w:val="19"/>
+          </w:rPr>
+          <w:t xml:space="preserve">Dependency vulnerability audit — npm audit --audit-level=high runs in the svc-alpha and svc-beta jobs; the build fails if any HIGH or CRITICAL vulnerability is detected in direct or transitive dependencies.</w:t>
+        </w:r>
+      </w:ins>
+    </w:p>
+    <w:p>
+      <w:pPr>
+        <w:pStyle w:val="ListParagraph"/>
+        <w:numPr>
+          <w:ilvl w:val="0"/>
+          <w:numId w:val="1"/>
+        </w:numPr>
+        <w:spacing w:after="60"/>
+        <w:rPr>
+          <w:ins w:id="113" w:author="Claude" w:date="2026-05-06T00:00:00Z"/>
+        </w:rPr>
+      </w:pPr>
+      <w:ins w:id="114" w:author="Claude" w:date="2026-05-06T00:00:00Z">
+        <w:r>
+          <w:rPr>
+            <w:sz w:val="19"/>
+            <w:szCs w:val="19"/>
+          </w:rPr>
+          <w:t xml:space="preserve">Container image scanning — Trivy scans each of the four Docker images immediately after build; fixable HIGH and CRITICAL CVEs block promotion. Images with only unfixed CVEs are logged but do not block.</w:t>
+        </w:r>
+      </w:ins>
+    </w:p>
+    <w:p>
+      <w:pPr>
+        <w:pStyle w:val="ListParagraph"/>
+        <w:numPr>
+          <w:ilvl w:val="0"/>
+          <w:numId w:val="1"/>
+        </w:numPr>
+        <w:spacing w:after="60"/>
+        <w:rPr>
+          <w:ins w:id="115" w:author="Claude" w:date="2026-05-06T00:00:00Z"/>
+        </w:rPr>
+      </w:pPr>
+      <w:ins w:id="116" w:author="Claude" w:date="2026-05-06T00:00:00Z">
+        <w:r>
+          <w:rPr>
+            <w:sz w:val="19"/>
+            <w:szCs w:val="19"/>
+          </w:rPr>
+          <w:t xml:space="preserve">Production deployment gate — the deploy-gate job requires manual approval from a designated reviewer configured in the GitHub Environment “production” before a push to main is considered deployment-ready. The approver’s identity, timestamp, and commit SHA are permanently recorded in the GitHub Actions audit log.</w:t>
+        </w:r>
+      </w:ins>
     </w:p>
     <w:p>
       <w:pPr>

</xml_diff>

<commit_message>
Update IDP local platform: Terraform modules, Helm charts, and docs
Expanded gitops and backstage Terraform modules, added ArgoCD Rollout
canary config and ingress templates to svc-alpha/beta Helm charts,
refreshed all four documentation .docx files, and added .gitattributes
and .gitignore.

Co-Authored-By: Claude Sonnet 4.6 <noreply@anthropic.com>
</commit_message>
<xml_diff>
--- a/idp-local/IDP_Local_Functional_Spec.docx
+++ b/idp-local/IDP_Local_Functional_Spec.docx
@@ -1918,7 +1918,7 @@
           <w:sz w:val="19"/>
           <w:szCs w:val="19"/>
         </w:rPr>
-        <w:t xml:space="preserve">platform — installs ingress, kyverno, crossplane, and two Kyverno ClusterPolicies</w:t>
+        <w:t>platform — installs nginx-ingress (admission webhook disabled), kyverno, and crossplane ClusterPolicies</w:t>
       </w:r>
     </w:p>
     <w:p>
@@ -1952,7 +1952,7 @@
           <w:sz w:val="19"/>
           <w:szCs w:val="19"/>
         </w:rPr>
-        <w:t xml:space="preserve">gitops — installs argo-cd and argo-rollouts, creates namespaces, deploys ArgoCD Application CRs and RBAC ConfigMap; depends on platform</w:t>
+        <w:t>gitops — installs argo-cd (with hostPath mount of /idp-local for the repo-server) and argo-rollouts, creates namespaces, deploys ArgoCD Application CRs and RBAC ConfigMap; depends on platform</w:t>
       </w:r>
     </w:p>
     <w:p>
@@ -2002,7 +2002,7 @@
           <w:sz w:val="19"/>
           <w:szCs w:val="19"/>
         </w:rPr>
-        <w:t xml:space="preserve">Argo CD monitors local Helm chart directories via file:// repoURL. Because Argo CD is configured with selfHeal: true, the only durable way to change a deployed release is to update the chart's values.yaml and trigger an Argo CD sync.</w:t>
+        <w:t>Argo CD monitors a single local file:// git repository at /idp-local (mounted into the repo-server pod via Docker Desktop hostPath); each Application sets path: charts/&lt;svc&gt;. The repo MUST be git-initialised and a .gitignore must exclude node_modules/ and .terraform/ to keep git pack-objects under the repo-server's memory limit (256Mi req / 1Gi limit). Because Argo CD is configured with selfHeal: true, the only durable way to change a deployed release is to update the chart's values.yaml and trigger an Argo CD sync.</w:t>
       </w:r>
     </w:p>
     <w:p>
@@ -3719,7 +3719,7 @@
         </w:rPr>
       </w:pPr>
       <w:r>
-        <w:t xml:space="preserve">3.7 Backstage Developer Portal</w:t>
+        <w:t>3.7 Backstage Developer Portal (chart-built ingress disabled; a separate kubectl_manifest Ingress provides the /backstage(/|$)(.*) regex path with rewrite-target and a /backstage → /backstage/ permanent redirect)</w:t>
       </w:r>
     </w:p>
     <w:p>

</xml_diff>